<commit_message>
Add personalized Magdalen/cat variant + full theory section to Hadoop guide
Agent-Logs-Url: https://github.com/Magdal04/Cloud-Computing-5/sessions/63e047c9-9c03-4283-b7cc-823043285757

Co-authored-by: Magdal04 <184515146+Magdal04@users.noreply.github.com>
</commit_message>
<xml_diff>
--- a/Lab6_Hadoop_Ghid_Elaborare.docx
+++ b/Lab6_Hadoop_Ghid_Elaborare.docx
@@ -1351,6 +1351,1786 @@
           <w:sz w:val="21"/>
         </w:rPr>
         <w:t>Aceste concepte sunt fundamentale în procesarea distribuită a datelor de mari dimensiuni. Hadoop MapReduce stă la baza multor sisteme moderne de Big Data (Spark, Hive, Pig), iar Google Cloud Dataproc simplifică semnificativ administrarea clusterelor Hadoop în cloud.</w:t>
+      </w:r>
+    </w:p>
+    <w:p>
+      <w:r>
+        <w:br w:type="page"/>
+      </w:r>
+    </w:p>
+    <w:p>
+      <w:pPr>
+        <w:pStyle w:val="Heading1"/>
+      </w:pPr>
+      <w:r>
+        <w:rPr>
+          <w:rFonts w:ascii="Calibri" w:hAnsi="Calibri"/>
+          <w:color w:val="27AE60"/>
+        </w:rPr>
+        <w:t>12. Bonus – Varianta Personalizată: Magdalen 🐱</w:t>
+      </w:r>
+    </w:p>
+    <w:p>
+      <w:r>
+        <w:rPr>
+          <w:rFonts w:ascii="Calibri" w:hAnsi="Calibri"/>
+          <w:color w:val="2C3E50"/>
+          <w:sz w:val="21"/>
+        </w:rPr>
+        <w:t>Această secțiune prezintă o variantă personalizată a laboratorului, adaptată pentru Magdalen. Tema de interes: pisicile! Vom înlocui textul clasic ("Ana are mere / Ana are pere") cu un text pe tema pisicilor și vom observa cum MapReduce numără cuvintele specifice acestei teme.</w:t>
+      </w:r>
+    </w:p>
+    <w:p>
+      <w:pPr>
+        <w:pStyle w:val="Heading2"/>
+      </w:pPr>
+      <w:r>
+        <w:rPr>
+          <w:rFonts w:ascii="Calibri" w:hAnsi="Calibri"/>
+          <w:color w:val="1A73E8"/>
+        </w:rPr>
+        <w:t>12.1 Fișierul de Intrare Personalizat – pisici.txt</w:t>
+      </w:r>
+    </w:p>
+    <w:p>
+      <w:r>
+        <w:rPr>
+          <w:rFonts w:ascii="Calibri" w:hAnsi="Calibri"/>
+          <w:sz w:val="21"/>
+        </w:rPr>
+        <w:t>Conținutul fișierului pisici.txt (varianta Magdalen):</w:t>
+      </w:r>
+    </w:p>
+    <w:p>
+      <w:pPr>
+        <w:shd w:val="clear" w:color="auto" w:fill="F2F3F4"/>
+        <w:ind w:left="432"/>
+      </w:pPr>
+      <w:r>
+        <w:rPr>
+          <w:rFonts w:ascii="Courier New" w:hAnsi="Courier New"/>
+          <w:b w:val="0"/>
+          <w:i w:val="0"/>
+          <w:color w:val="1E1E1E"/>
+          <w:sz w:val="18"/>
+        </w:rPr>
+        <w:t xml:space="preserve">Pisica mea se numeste Mochi.</w:t>
+        <w:br/>
+        <w:t xml:space="preserve">Mochi doarme mult si mananca peste.</w:t>
+        <w:br/>
+        <w:t xml:space="preserve">Pisica lui Magdalen este Mochi.</w:t>
+        <w:br/>
+        <w:t xml:space="preserve">Mochi este o pisica portocalie si doarme tot timpul.</w:t>
+        <w:br/>
+        <w:t xml:space="preserve">Magdalen iubeste pisicile si Mochi o iubeste pe Magdalen.</w:t>
+      </w:r>
+    </w:p>
+    <w:p>
+      <w:r>
+        <w:rPr>
+          <w:rFonts w:ascii="Calibri" w:hAnsi="Calibri"/>
+          <w:sz w:val="21"/>
+        </w:rPr>
+        <w:t>Analiza manuală a cuvintelor din text (rezultatul așteptat al WordCount):</w:t>
+      </w:r>
+    </w:p>
+    <w:tbl>
+      <w:tblPr>
+        <w:tblStyle w:val="TableGrid"/>
+        <w:tblW w:type="auto" w:w="0"/>
+        <w:tblLook w:firstColumn="1" w:firstRow="1" w:lastColumn="0" w:lastRow="0" w:noHBand="0" w:noVBand="1" w:val="04A0"/>
+      </w:tblPr>
+      <w:tblGrid>
+        <w:gridCol w:w="4320"/>
+        <w:gridCol w:w="4320"/>
+      </w:tblGrid>
+      <w:tr>
+        <w:tc>
+          <w:tcPr>
+            <w:tcW w:type="dxa" w:w="4320"/>
+          </w:tcPr>
+          <w:p>
+            <w:r>
+              <w:rPr>
+                <w:rFonts w:ascii="Calibri" w:hAnsi="Calibri"/>
+                <w:b/>
+                <w:sz w:val="20"/>
+              </w:rPr>
+              <w:t>Cuvânt</w:t>
+            </w:r>
+          </w:p>
+        </w:tc>
+        <w:tc>
+          <w:tcPr>
+            <w:tcW w:type="dxa" w:w="4320"/>
+          </w:tcPr>
+          <w:p>
+            <w:r>
+              <w:rPr>
+                <w:rFonts w:ascii="Calibri" w:hAnsi="Calibri"/>
+                <w:b/>
+                <w:sz w:val="20"/>
+              </w:rPr>
+              <w:t>Frecvență</w:t>
+            </w:r>
+          </w:p>
+        </w:tc>
+      </w:tr>
+      <w:tr>
+        <w:tc>
+          <w:tcPr>
+            <w:tcW w:type="dxa" w:w="4320"/>
+          </w:tcPr>
+          <w:p>
+            <w:r>
+              <w:rPr>
+                <w:rFonts w:ascii="Calibri" w:hAnsi="Calibri"/>
+                <w:sz w:val="20"/>
+              </w:rPr>
+              <w:t>Magdalen</w:t>
+            </w:r>
+          </w:p>
+        </w:tc>
+        <w:tc>
+          <w:tcPr>
+            <w:tcW w:type="dxa" w:w="4320"/>
+          </w:tcPr>
+          <w:p>
+            <w:r>
+              <w:rPr>
+                <w:rFonts w:ascii="Calibri" w:hAnsi="Calibri"/>
+                <w:sz w:val="20"/>
+              </w:rPr>
+              <w:t>3</w:t>
+            </w:r>
+          </w:p>
+        </w:tc>
+      </w:tr>
+      <w:tr>
+        <w:tc>
+          <w:tcPr>
+            <w:tcW w:type="dxa" w:w="4320"/>
+          </w:tcPr>
+          <w:p>
+            <w:r>
+              <w:rPr>
+                <w:rFonts w:ascii="Calibri" w:hAnsi="Calibri"/>
+                <w:sz w:val="20"/>
+              </w:rPr>
+              <w:t>Mochi</w:t>
+            </w:r>
+          </w:p>
+        </w:tc>
+        <w:tc>
+          <w:tcPr>
+            <w:tcW w:type="dxa" w:w="4320"/>
+          </w:tcPr>
+          <w:p>
+            <w:r>
+              <w:rPr>
+                <w:rFonts w:ascii="Calibri" w:hAnsi="Calibri"/>
+                <w:sz w:val="20"/>
+              </w:rPr>
+              <w:t>5</w:t>
+            </w:r>
+          </w:p>
+        </w:tc>
+      </w:tr>
+      <w:tr>
+        <w:tc>
+          <w:tcPr>
+            <w:tcW w:type="dxa" w:w="4320"/>
+          </w:tcPr>
+          <w:p>
+            <w:r>
+              <w:rPr>
+                <w:rFonts w:ascii="Calibri" w:hAnsi="Calibri"/>
+                <w:sz w:val="20"/>
+              </w:rPr>
+              <w:t>pisica / pisicile</w:t>
+            </w:r>
+          </w:p>
+        </w:tc>
+        <w:tc>
+          <w:tcPr>
+            <w:tcW w:type="dxa" w:w="4320"/>
+          </w:tcPr>
+          <w:p>
+            <w:r>
+              <w:rPr>
+                <w:rFonts w:ascii="Calibri" w:hAnsi="Calibri"/>
+                <w:sz w:val="20"/>
+              </w:rPr>
+              <w:t>3</w:t>
+            </w:r>
+          </w:p>
+        </w:tc>
+      </w:tr>
+      <w:tr>
+        <w:tc>
+          <w:tcPr>
+            <w:tcW w:type="dxa" w:w="4320"/>
+          </w:tcPr>
+          <w:p>
+            <w:r>
+              <w:rPr>
+                <w:rFonts w:ascii="Calibri" w:hAnsi="Calibri"/>
+                <w:sz w:val="20"/>
+              </w:rPr>
+              <w:t>doarme</w:t>
+            </w:r>
+          </w:p>
+        </w:tc>
+        <w:tc>
+          <w:tcPr>
+            <w:tcW w:type="dxa" w:w="4320"/>
+          </w:tcPr>
+          <w:p>
+            <w:r>
+              <w:rPr>
+                <w:rFonts w:ascii="Calibri" w:hAnsi="Calibri"/>
+                <w:sz w:val="20"/>
+              </w:rPr>
+              <w:t>2</w:t>
+            </w:r>
+          </w:p>
+        </w:tc>
+      </w:tr>
+      <w:tr>
+        <w:tc>
+          <w:tcPr>
+            <w:tcW w:type="dxa" w:w="4320"/>
+          </w:tcPr>
+          <w:p>
+            <w:r>
+              <w:rPr>
+                <w:rFonts w:ascii="Calibri" w:hAnsi="Calibri"/>
+                <w:sz w:val="20"/>
+              </w:rPr>
+              <w:t>iubeste</w:t>
+            </w:r>
+          </w:p>
+        </w:tc>
+        <w:tc>
+          <w:tcPr>
+            <w:tcW w:type="dxa" w:w="4320"/>
+          </w:tcPr>
+          <w:p>
+            <w:r>
+              <w:rPr>
+                <w:rFonts w:ascii="Calibri" w:hAnsi="Calibri"/>
+                <w:sz w:val="20"/>
+              </w:rPr>
+              <w:t>2</w:t>
+            </w:r>
+          </w:p>
+        </w:tc>
+      </w:tr>
+      <w:tr>
+        <w:tc>
+          <w:tcPr>
+            <w:tcW w:type="dxa" w:w="4320"/>
+          </w:tcPr>
+          <w:p>
+            <w:r>
+              <w:rPr>
+                <w:rFonts w:ascii="Calibri" w:hAnsi="Calibri"/>
+                <w:sz w:val="20"/>
+              </w:rPr>
+              <w:t>mananca</w:t>
+            </w:r>
+          </w:p>
+        </w:tc>
+        <w:tc>
+          <w:tcPr>
+            <w:tcW w:type="dxa" w:w="4320"/>
+          </w:tcPr>
+          <w:p>
+            <w:r>
+              <w:rPr>
+                <w:rFonts w:ascii="Calibri" w:hAnsi="Calibri"/>
+                <w:sz w:val="20"/>
+              </w:rPr>
+              <w:t>1</w:t>
+            </w:r>
+          </w:p>
+        </w:tc>
+      </w:tr>
+      <w:tr>
+        <w:tc>
+          <w:tcPr>
+            <w:tcW w:type="dxa" w:w="4320"/>
+          </w:tcPr>
+          <w:p>
+            <w:r>
+              <w:rPr>
+                <w:rFonts w:ascii="Calibri" w:hAnsi="Calibri"/>
+                <w:sz w:val="20"/>
+              </w:rPr>
+              <w:t>este</w:t>
+            </w:r>
+          </w:p>
+        </w:tc>
+        <w:tc>
+          <w:tcPr>
+            <w:tcW w:type="dxa" w:w="4320"/>
+          </w:tcPr>
+          <w:p>
+            <w:r>
+              <w:rPr>
+                <w:rFonts w:ascii="Calibri" w:hAnsi="Calibri"/>
+                <w:sz w:val="20"/>
+              </w:rPr>
+              <w:t>2</w:t>
+            </w:r>
+          </w:p>
+        </w:tc>
+      </w:tr>
+      <w:tr>
+        <w:tc>
+          <w:tcPr>
+            <w:tcW w:type="dxa" w:w="4320"/>
+          </w:tcPr>
+          <w:p>
+            <w:r>
+              <w:rPr>
+                <w:rFonts w:ascii="Calibri" w:hAnsi="Calibri"/>
+                <w:sz w:val="20"/>
+              </w:rPr>
+              <w:t>si</w:t>
+            </w:r>
+          </w:p>
+        </w:tc>
+        <w:tc>
+          <w:tcPr>
+            <w:tcW w:type="dxa" w:w="4320"/>
+          </w:tcPr>
+          <w:p>
+            <w:r>
+              <w:rPr>
+                <w:rFonts w:ascii="Calibri" w:hAnsi="Calibri"/>
+                <w:sz w:val="20"/>
+              </w:rPr>
+              <w:t>2</w:t>
+            </w:r>
+          </w:p>
+        </w:tc>
+      </w:tr>
+      <w:tr>
+        <w:tc>
+          <w:tcPr>
+            <w:tcW w:type="dxa" w:w="4320"/>
+          </w:tcPr>
+          <w:p>
+            <w:r>
+              <w:rPr>
+                <w:rFonts w:ascii="Calibri" w:hAnsi="Calibri"/>
+                <w:sz w:val="20"/>
+              </w:rPr>
+              <w:t>portocalie</w:t>
+            </w:r>
+          </w:p>
+        </w:tc>
+        <w:tc>
+          <w:tcPr>
+            <w:tcW w:type="dxa" w:w="4320"/>
+          </w:tcPr>
+          <w:p>
+            <w:r>
+              <w:rPr>
+                <w:rFonts w:ascii="Calibri" w:hAnsi="Calibri"/>
+                <w:sz w:val="20"/>
+              </w:rPr>
+              <w:t>1</w:t>
+            </w:r>
+          </w:p>
+        </w:tc>
+      </w:tr>
+      <w:tr>
+        <w:tc>
+          <w:tcPr>
+            <w:tcW w:type="dxa" w:w="4320"/>
+          </w:tcPr>
+          <w:p>
+            <w:r>
+              <w:rPr>
+                <w:rFonts w:ascii="Calibri" w:hAnsi="Calibri"/>
+                <w:sz w:val="20"/>
+              </w:rPr>
+              <w:t>peste</w:t>
+            </w:r>
+          </w:p>
+        </w:tc>
+        <w:tc>
+          <w:tcPr>
+            <w:tcW w:type="dxa" w:w="4320"/>
+          </w:tcPr>
+          <w:p>
+            <w:r>
+              <w:rPr>
+                <w:rFonts w:ascii="Calibri" w:hAnsi="Calibri"/>
+                <w:sz w:val="20"/>
+              </w:rPr>
+              <w:t>1</w:t>
+            </w:r>
+          </w:p>
+        </w:tc>
+      </w:tr>
+    </w:tbl>
+    <w:p/>
+    <w:p>
+      <w:r>
+        <w:rPr>
+          <w:rFonts w:ascii="Calibri" w:hAnsi="Calibri"/>
+          <w:sz w:val="21"/>
+        </w:rPr>
+        <w:t>Notă: WordCount este case-sensitive (distinge litere mari de mici), deci "Mochi" și "mochi" ar fi numărate separat dacă ar apărea ambele forme. În textul de mai sus, "Mochi" apare întotdeauna cu M mare, deci va fi numărat o singură cheie.</w:t>
+      </w:r>
+    </w:p>
+    <w:p>
+      <w:pPr>
+        <w:pStyle w:val="Heading2"/>
+      </w:pPr>
+      <w:r>
+        <w:rPr>
+          <w:rFonts w:ascii="Calibri" w:hAnsi="Calibri"/>
+          <w:color w:val="1A73E8"/>
+        </w:rPr>
+        <w:t>12.2 Pașii de Urmat pentru Varianta Personalizată</w:t>
+      </w:r>
+    </w:p>
+    <w:p>
+      <w:r>
+        <w:rPr>
+          <w:rFonts w:ascii="Calibri" w:hAnsi="Calibri"/>
+          <w:i/>
+          <w:color w:val="E67E22"/>
+          <w:sz w:val="21"/>
+        </w:rPr>
+        <w:t>⚑ Creează local un fișier text denumit pisici.txt cu textul de mai sus (cinci propoziții despre Mochi și Magdalen).</w:t>
+      </w:r>
+    </w:p>
+    <w:p>
+      <w:r>
+        <w:rPr>
+          <w:rFonts w:ascii="Calibri" w:hAnsi="Calibri"/>
+          <w:i/>
+          <w:color w:val="E67E22"/>
+          <w:sz w:val="21"/>
+        </w:rPr>
+        <w:t>⚑ Urcă fișierul pisici.txt în GCS, în folderul "input_pisici" din bucket-ul tău Dataproc (Cloud Storage → Buckets → &lt;BUCKET&gt; → Create folder "input_pisici" → Upload files).</w:t>
+      </w:r>
+    </w:p>
+    <w:p>
+      <w:r>
+        <w:rPr>
+          <w:rFonts w:ascii="Calibri" w:hAnsi="Calibri"/>
+          <w:i/>
+          <w:color w:val="E67E22"/>
+          <w:sz w:val="21"/>
+        </w:rPr>
+        <w:t>⚑ Trimite un nou job Hadoop din Dataproc → Jobs → Submit Job, cu aceleași configurări ca la secțiunea 6, dar modificând câmpul Arguments:</w:t>
+        <w:br/>
+        <w:t xml:space="preserve">   • Argument 1: gs://&lt;BUCKET&gt;/input_pisici/pisici.txt</w:t>
+        <w:br/>
+        <w:t xml:space="preserve">   • Argument 2: gs://&lt;BUCKET&gt;/output_pisici</w:t>
+        <w:br/>
+        <w:t xml:space="preserve">   (Asigură-te că output_pisici nu există deja – Hadoop nu suprascrie directoare!)</w:t>
+      </w:r>
+    </w:p>
+    <w:p>
+      <w:r>
+        <w:rPr>
+          <w:rFonts w:ascii="Calibri" w:hAnsi="Calibri"/>
+          <w:i/>
+          <w:color w:val="E67E22"/>
+          <w:sz w:val="21"/>
+        </w:rPr>
+        <w:t>⚑ Monitorizează job-ul până la starea "Succeeded", apoi deschide gs://&lt;BUCKET&gt;/output_pisici/ și verifică fișierele part-r-*.</w:t>
+      </w:r>
+    </w:p>
+    <w:p>
+      <w:r>
+        <w:rPr>
+          <w:rFonts w:ascii="Calibri" w:hAnsi="Calibri"/>
+          <w:i/>
+          <w:color w:val="E67E22"/>
+          <w:sz w:val="21"/>
+        </w:rPr>
+        <w:t>⚑ Concatenează rezultatele într-un fișier unic folosind Cloud Shell:</w:t>
+        <w:br/>
+        <w:t xml:space="preserve">   gsutil cat gs://&lt;BUCKET&gt;/output_pisici/part-r-* \</w:t>
+        <w:br/>
+        <w:t xml:space="preserve">     | gsutil cp - gs://&lt;BUCKET&gt;/output_pisici/rezultat_pisici.txt</w:t>
+        <w:br/>
+        <w:t xml:space="preserve">   Deschide rezultat_pisici.txt și verifică că "Mochi" apare cu frecvența 5.</w:t>
+      </w:r>
+    </w:p>
+    <w:p>
+      <w:pPr>
+        <w:pStyle w:val="Heading2"/>
+      </w:pPr>
+      <w:r>
+        <w:rPr>
+          <w:rFonts w:ascii="Calibri" w:hAnsi="Calibri"/>
+          <w:color w:val="1A73E8"/>
+        </w:rPr>
+        <w:t>12.3 De ce este Importantă Personalizarea?</w:t>
+      </w:r>
+    </w:p>
+    <w:p>
+      <w:r>
+        <w:rPr>
+          <w:rFonts w:ascii="Calibri" w:hAnsi="Calibri"/>
+          <w:sz w:val="21"/>
+        </w:rPr>
+        <w:t>Varianta personalizată demonstrează că ai înțeles principiul fundamental al MapReduce: acesta nu este limitat la un text anume. Același cod Java WordCount.java funcționează identic pe orice fișier text – fie că acesta vorbește despre fructe sau despre pisici. Aceasta este puterea abstractizării în Hadoop: logica de procesare este separată complet de date.</w:t>
+      </w:r>
+    </w:p>
+    <w:p>
+      <w:r>
+        <w:rPr>
+          <w:rFonts w:ascii="Calibri" w:hAnsi="Calibri"/>
+          <w:sz w:val="21"/>
+        </w:rPr>
+        <w:t>Prin înlocuirea datelor de intrare cu un text personal (pisici.txt), demonstrezi că:</w:t>
+      </w:r>
+    </w:p>
+    <w:p>
+      <w:pPr>
+        <w:pStyle w:val="ListBullet"/>
+      </w:pPr>
+      <w:r>
+        <w:rPr>
+          <w:rFonts w:ascii="Calibri" w:hAnsi="Calibri"/>
+          <w:sz w:val="21"/>
+        </w:rPr>
+        <w:t>Ai înțeles că job-ul MapReduce este generic și reutilizabil pe orice date.</w:t>
+      </w:r>
+    </w:p>
+    <w:p>
+      <w:pPr>
+        <w:pStyle w:val="ListBullet"/>
+      </w:pPr>
+      <w:r>
+        <w:rPr>
+          <w:rFonts w:ascii="Calibri" w:hAnsi="Calibri"/>
+          <w:sz w:val="21"/>
+        </w:rPr>
+        <w:t>Știi cum să configurezi calea de intrare și ieșire în Dataproc.</w:t>
+      </w:r>
+    </w:p>
+    <w:p>
+      <w:pPr>
+        <w:pStyle w:val="ListBullet"/>
+      </w:pPr>
+      <w:r>
+        <w:rPr>
+          <w:rFonts w:ascii="Calibri" w:hAnsi="Calibri"/>
+          <w:sz w:val="21"/>
+        </w:rPr>
+        <w:t>Poți interpreta corect rezultatele (frecvențele cuvintelor din propriul text).</w:t>
+      </w:r>
+    </w:p>
+    <w:p>
+      <w:r>
+        <w:br w:type="page"/>
+      </w:r>
+    </w:p>
+    <w:p>
+      <w:pPr>
+        <w:pStyle w:val="Heading1"/>
+      </w:pPr>
+      <w:r>
+        <w:rPr>
+          <w:rFonts w:ascii="Calibri" w:hAnsi="Calibri"/>
+          <w:color w:val="1A73E8"/>
+        </w:rPr>
+        <w:t>13. Aspecte Teoretice Esențiale</w:t>
+      </w:r>
+    </w:p>
+    <w:p>
+      <w:r>
+        <w:rPr>
+          <w:rFonts w:ascii="Calibri" w:hAnsi="Calibri"/>
+          <w:color w:val="2C3E50"/>
+          <w:sz w:val="21"/>
+        </w:rPr>
+        <w:t>Această secțiune sintetizează conceptele fundamentale pe care le-am aplicat practic în laboratorul 6. Înțelegerea lor stă la baza oricărei lucrări cu sisteme de Big Data.</w:t>
+      </w:r>
+    </w:p>
+    <w:p>
+      <w:pPr>
+        <w:pStyle w:val="Heading2"/>
+      </w:pPr>
+      <w:r>
+        <w:rPr>
+          <w:rFonts w:ascii="Calibri" w:hAnsi="Calibri"/>
+          <w:color w:val="1A73E8"/>
+        </w:rPr>
+        <w:t>13.1 Ce Este Hadoop și De Ce L-am Folosit?</w:t>
+      </w:r>
+    </w:p>
+    <w:p>
+      <w:pPr>
+        <w:shd w:val="clear" w:color="auto" w:fill="EAF7EC"/>
+      </w:pPr>
+      <w:r>
+        <w:rPr>
+          <w:rFonts w:ascii="Calibri" w:hAnsi="Calibri"/>
+          <w:b/>
+          <w:color w:val="27AE60"/>
+          <w:sz w:val="21"/>
+        </w:rPr>
+        <w:t>📚  Definiție: Apache Hadoop</w:t>
+      </w:r>
+    </w:p>
+    <w:p>
+      <w:pPr>
+        <w:shd w:val="clear" w:color="auto" w:fill="EAF7EC"/>
+      </w:pPr>
+      <w:r>
+        <w:rPr>
+          <w:rFonts w:ascii="Calibri" w:hAnsi="Calibri"/>
+          <w:sz w:val="20"/>
+        </w:rPr>
+        <w:t>Apache Hadoop este un cadru open-source (Apache Software Foundation) creat pentru a procesa și stoca volume mari de date (Big Data) distribuit pe un cluster de calculatoare de tip commodity (hardware obișnuit, ieftin).</w:t>
+      </w:r>
+    </w:p>
+    <w:p>
+      <w:pPr>
+        <w:shd w:val="clear" w:color="auto" w:fill="EAF7EC"/>
+      </w:pPr>
+      <w:r>
+        <w:rPr>
+          <w:rFonts w:ascii="Calibri" w:hAnsi="Calibri"/>
+          <w:sz w:val="20"/>
+        </w:rPr>
+      </w:r>
+    </w:p>
+    <w:p>
+      <w:pPr>
+        <w:shd w:val="clear" w:color="auto" w:fill="EAF7EC"/>
+      </w:pPr>
+      <w:r>
+        <w:rPr>
+          <w:rFonts w:ascii="Calibri" w:hAnsi="Calibri"/>
+          <w:sz w:val="20"/>
+        </w:rPr>
+        <w:t>Componentele principale:</w:t>
+      </w:r>
+    </w:p>
+    <w:p>
+      <w:pPr>
+        <w:shd w:val="clear" w:color="auto" w:fill="EAF7EC"/>
+      </w:pPr>
+      <w:r>
+        <w:rPr>
+          <w:rFonts w:ascii="Calibri" w:hAnsi="Calibri"/>
+          <w:sz w:val="20"/>
+        </w:rPr>
+        <w:t xml:space="preserve">  • HDFS (Hadoop Distributed File System) – sistemul de fișiere distribuit care împarte     fișierele în blocuri (default 128 MB) și le replică pe 3 noduri diferite pentru     toleranță la erori (fault tolerance).</w:t>
+      </w:r>
+    </w:p>
+    <w:p>
+      <w:pPr>
+        <w:shd w:val="clear" w:color="auto" w:fill="EAF7EC"/>
+      </w:pPr>
+      <w:r>
+        <w:rPr>
+          <w:rFonts w:ascii="Calibri" w:hAnsi="Calibri"/>
+          <w:sz w:val="20"/>
+        </w:rPr>
+        <w:t xml:space="preserve">  • MapReduce – modelul de programare distribuit pentru procesarea paralelă a datelor.</w:t>
+      </w:r>
+    </w:p>
+    <w:p>
+      <w:pPr>
+        <w:shd w:val="clear" w:color="auto" w:fill="EAF7EC"/>
+      </w:pPr>
+      <w:r>
+        <w:rPr>
+          <w:rFonts w:ascii="Calibri" w:hAnsi="Calibri"/>
+          <w:sz w:val="20"/>
+        </w:rPr>
+        <w:t xml:space="preserve">  • YARN (Yet Another Resource Negotiator) – managerul de resurse al clusterului, care     alocă CPU și memorie task-urilor.</w:t>
+      </w:r>
+    </w:p>
+    <w:p/>
+    <w:p>
+      <w:r>
+        <w:rPr>
+          <w:rFonts w:ascii="Calibri" w:hAnsi="Calibri"/>
+          <w:sz w:val="21"/>
+        </w:rPr>
+        <w:t>De ce am ales Hadoop în loc de un simplu program Python local? Deoarece pentru seturi de date de ordinul GB sau TB, un singur calculator nu are nici resursele de stocare, nici puterea de procesare necesară. Hadoop distribuie automat atât datele cât și computația pe zeci sau sute de noduri, reducând drastic timpul de procesare prin paralelism.</w:t>
+      </w:r>
+    </w:p>
+    <w:p>
+      <w:pPr>
+        <w:pStyle w:val="Heading2"/>
+      </w:pPr>
+      <w:r>
+        <w:rPr>
+          <w:rFonts w:ascii="Calibri" w:hAnsi="Calibri"/>
+          <w:color w:val="1A73E8"/>
+        </w:rPr>
+        <w:t>13.2 Modelul MapReduce – Fazele Explicitate</w:t>
+      </w:r>
+    </w:p>
+    <w:p>
+      <w:pPr>
+        <w:shd w:val="clear" w:color="auto" w:fill="EAF7EC"/>
+      </w:pPr>
+      <w:r>
+        <w:rPr>
+          <w:rFonts w:ascii="Calibri" w:hAnsi="Calibri"/>
+          <w:b/>
+          <w:color w:val="27AE60"/>
+          <w:sz w:val="21"/>
+        </w:rPr>
+        <w:t>📚  Cele 4 faze ale unui job MapReduce</w:t>
+      </w:r>
+    </w:p>
+    <w:p>
+      <w:pPr>
+        <w:shd w:val="clear" w:color="auto" w:fill="EAF7EC"/>
+      </w:pPr>
+      <w:r>
+        <w:rPr>
+          <w:rFonts w:ascii="Calibri" w:hAnsi="Calibri"/>
+          <w:sz w:val="20"/>
+        </w:rPr>
+        <w:t>1. INPUT SPLIT – HDFS împarte fișierul de intrare în blocuri și le distribuie nodurilor.</w:t>
+      </w:r>
+    </w:p>
+    <w:p>
+      <w:pPr>
+        <w:shd w:val="clear" w:color="auto" w:fill="EAF7EC"/>
+      </w:pPr>
+      <w:r>
+        <w:rPr>
+          <w:rFonts w:ascii="Calibri" w:hAnsi="Calibri"/>
+          <w:sz w:val="20"/>
+        </w:rPr>
+      </w:r>
+    </w:p>
+    <w:p>
+      <w:pPr>
+        <w:shd w:val="clear" w:color="auto" w:fill="EAF7EC"/>
+      </w:pPr>
+      <w:r>
+        <w:rPr>
+          <w:rFonts w:ascii="Calibri" w:hAnsi="Calibri"/>
+          <w:sz w:val="20"/>
+        </w:rPr>
+        <w:t>2. MAP – fiecare Mapper primește o linie de text și emite perechi (cheie, valoare).</w:t>
+      </w:r>
+    </w:p>
+    <w:p>
+      <w:pPr>
+        <w:shd w:val="clear" w:color="auto" w:fill="EAF7EC"/>
+      </w:pPr>
+      <w:r>
+        <w:rPr>
+          <w:rFonts w:ascii="Calibri" w:hAnsi="Calibri"/>
+          <w:sz w:val="20"/>
+        </w:rPr>
+        <w:t xml:space="preserve">   Exemplu WordCount: linia "Mochi doarme mult" →</w:t>
+      </w:r>
+    </w:p>
+    <w:p>
+      <w:pPr>
+        <w:shd w:val="clear" w:color="auto" w:fill="EAF7EC"/>
+      </w:pPr>
+      <w:r>
+        <w:rPr>
+          <w:rFonts w:ascii="Calibri" w:hAnsi="Calibri"/>
+          <w:sz w:val="20"/>
+        </w:rPr>
+        <w:t xml:space="preserve">     emit(Mochi, 1), emit(doarme, 1), emit(mult, 1)</w:t>
+      </w:r>
+    </w:p>
+    <w:p>
+      <w:pPr>
+        <w:shd w:val="clear" w:color="auto" w:fill="EAF7EC"/>
+      </w:pPr>
+      <w:r>
+        <w:rPr>
+          <w:rFonts w:ascii="Calibri" w:hAnsi="Calibri"/>
+          <w:sz w:val="20"/>
+        </w:rPr>
+      </w:r>
+    </w:p>
+    <w:p>
+      <w:pPr>
+        <w:shd w:val="clear" w:color="auto" w:fill="EAF7EC"/>
+      </w:pPr>
+      <w:r>
+        <w:rPr>
+          <w:rFonts w:ascii="Calibri" w:hAnsi="Calibri"/>
+          <w:sz w:val="20"/>
+        </w:rPr>
+        <w:t>3. SHUFFLE AND SORT – framework-ul grupează automat toate valorile cu aceeași cheie</w:t>
+      </w:r>
+    </w:p>
+    <w:p>
+      <w:pPr>
+        <w:shd w:val="clear" w:color="auto" w:fill="EAF7EC"/>
+      </w:pPr>
+      <w:r>
+        <w:rPr>
+          <w:rFonts w:ascii="Calibri" w:hAnsi="Calibri"/>
+          <w:sz w:val="20"/>
+        </w:rPr>
+        <w:t xml:space="preserve">   și le sortează înainte de a le trimite Reducer-ilor.</w:t>
+      </w:r>
+    </w:p>
+    <w:p>
+      <w:pPr>
+        <w:shd w:val="clear" w:color="auto" w:fill="EAF7EC"/>
+      </w:pPr>
+      <w:r>
+        <w:rPr>
+          <w:rFonts w:ascii="Calibri" w:hAnsi="Calibri"/>
+          <w:sz w:val="20"/>
+        </w:rPr>
+        <w:t xml:space="preserve">   Exemplu: (Mochi, [1, 1, 1, 1, 1]) → trimis la Reducer X</w:t>
+      </w:r>
+    </w:p>
+    <w:p>
+      <w:pPr>
+        <w:shd w:val="clear" w:color="auto" w:fill="EAF7EC"/>
+      </w:pPr>
+      <w:r>
+        <w:rPr>
+          <w:rFonts w:ascii="Calibri" w:hAnsi="Calibri"/>
+          <w:sz w:val="20"/>
+        </w:rPr>
+      </w:r>
+    </w:p>
+    <w:p>
+      <w:pPr>
+        <w:shd w:val="clear" w:color="auto" w:fill="EAF7EC"/>
+      </w:pPr>
+      <w:r>
+        <w:rPr>
+          <w:rFonts w:ascii="Calibri" w:hAnsi="Calibri"/>
+          <w:sz w:val="20"/>
+        </w:rPr>
+        <w:t>4. REDUCE – fiecare Reducer primește o cheie și lista valorilor asociate, le agregă</w:t>
+      </w:r>
+    </w:p>
+    <w:p>
+      <w:pPr>
+        <w:shd w:val="clear" w:color="auto" w:fill="EAF7EC"/>
+      </w:pPr>
+      <w:r>
+        <w:rPr>
+          <w:rFonts w:ascii="Calibri" w:hAnsi="Calibri"/>
+          <w:sz w:val="20"/>
+        </w:rPr>
+        <w:t xml:space="preserve">   și emite rezultatul final.</w:t>
+      </w:r>
+    </w:p>
+    <w:p>
+      <w:pPr>
+        <w:shd w:val="clear" w:color="auto" w:fill="EAF7EC"/>
+      </w:pPr>
+      <w:r>
+        <w:rPr>
+          <w:rFonts w:ascii="Calibri" w:hAnsi="Calibri"/>
+          <w:sz w:val="20"/>
+        </w:rPr>
+        <w:t xml:space="preserve">   Exemplu: reduce(Mochi, [1,1,1,1,1]) → emit(Mochi, 5)</w:t>
+      </w:r>
+    </w:p>
+    <w:p/>
+    <w:p>
+      <w:r>
+        <w:rPr>
+          <w:rFonts w:ascii="Calibri" w:hAnsi="Calibri"/>
+          <w:sz w:val="21"/>
+        </w:rPr>
+        <w:t>Separarea clară între faza Map (transformare) și faza Reduce (agregare) permite scalabilitate orizontală: dacă datele cresc de 10 ori, adăugăm de 10 ori mai multe noduri și timpul de procesare rămâne aproximativ constant.</w:t>
+      </w:r>
+    </w:p>
+    <w:p>
+      <w:pPr>
+        <w:pStyle w:val="Heading2"/>
+      </w:pPr>
+      <w:r>
+        <w:rPr>
+          <w:rFonts w:ascii="Calibri" w:hAnsi="Calibri"/>
+          <w:color w:val="1A73E8"/>
+        </w:rPr>
+        <w:t>13.3 Google Cloud Dataproc – Hadoop Managed în Cloud</w:t>
+      </w:r>
+    </w:p>
+    <w:p>
+      <w:pPr>
+        <w:shd w:val="clear" w:color="auto" w:fill="EAF7EC"/>
+      </w:pPr>
+      <w:r>
+        <w:rPr>
+          <w:rFonts w:ascii="Calibri" w:hAnsi="Calibri"/>
+          <w:b/>
+          <w:color w:val="27AE60"/>
+          <w:sz w:val="21"/>
+        </w:rPr>
+        <w:t>📚  Ce face Dataproc diferit față de un cluster Hadoop on-premise?</w:t>
+      </w:r>
+    </w:p>
+    <w:p>
+      <w:pPr>
+        <w:shd w:val="clear" w:color="auto" w:fill="EAF7EC"/>
+      </w:pPr>
+      <w:r>
+        <w:rPr>
+          <w:rFonts w:ascii="Calibri" w:hAnsi="Calibri"/>
+          <w:sz w:val="20"/>
+        </w:rPr>
+        <w:t>• Provizionare rapidă: un cluster se creează în 60-90 secunde (față de ore/zile on-premise).</w:t>
+      </w:r>
+    </w:p>
+    <w:p>
+      <w:pPr>
+        <w:shd w:val="clear" w:color="auto" w:fill="EAF7EC"/>
+      </w:pPr>
+      <w:r>
+        <w:rPr>
+          <w:rFonts w:ascii="Calibri" w:hAnsi="Calibri"/>
+          <w:sz w:val="20"/>
+        </w:rPr>
+        <w:t>• Scalabilitate: poți adăuga/elimina noduri worker în timp real sau folosi noduri   preemptible (mai ieftine) pentru task-uri tolerante la întreruperi.</w:t>
+      </w:r>
+    </w:p>
+    <w:p>
+      <w:pPr>
+        <w:shd w:val="clear" w:color="auto" w:fill="EAF7EC"/>
+      </w:pPr>
+      <w:r>
+        <w:rPr>
+          <w:rFonts w:ascii="Calibri" w:hAnsi="Calibri"/>
+          <w:sz w:val="20"/>
+        </w:rPr>
+        <w:t>• Integrare nativă cu GCS: fișierele de intrare/ieșire sunt stocate în Google Cloud   Storage, nu în HDFS local – avantaj: datele persistă chiar dacă clusterul este șters.</w:t>
+      </w:r>
+    </w:p>
+    <w:p>
+      <w:pPr>
+        <w:shd w:val="clear" w:color="auto" w:fill="EAF7EC"/>
+      </w:pPr>
+      <w:r>
+        <w:rPr>
+          <w:rFonts w:ascii="Calibri" w:hAnsi="Calibri"/>
+          <w:sz w:val="20"/>
+        </w:rPr>
+        <w:t>• Cost: plătești DOAR cât timp clusterul rulează → de aceea este esențial să îl ștergi   după finalizarea laboratorului!</w:t>
+      </w:r>
+    </w:p>
+    <w:p>
+      <w:pPr>
+        <w:shd w:val="clear" w:color="auto" w:fill="EAF7EC"/>
+      </w:pPr>
+      <w:r>
+        <w:rPr>
+          <w:rFonts w:ascii="Calibri" w:hAnsi="Calibri"/>
+          <w:sz w:val="20"/>
+        </w:rPr>
+        <w:t>• Block size în GCS vs HDFS: în HDFS implicit 128MB; în GCS Hadoop poate seta automat   64MB sau 128MB, deoarece GCS gestionează propria sa stocare internă.</w:t>
+      </w:r>
+    </w:p>
+    <w:p/>
+    <w:p>
+      <w:pPr>
+        <w:pStyle w:val="Heading2"/>
+      </w:pPr>
+      <w:r>
+        <w:rPr>
+          <w:rFonts w:ascii="Calibri" w:hAnsi="Calibri"/>
+          <w:color w:val="1A73E8"/>
+        </w:rPr>
+        <w:t>13.4 Aplicația WordCount – Analiza Codului Java</w:t>
+      </w:r>
+    </w:p>
+    <w:p>
+      <w:pPr>
+        <w:shd w:val="clear" w:color="auto" w:fill="EAF7EC"/>
+      </w:pPr>
+      <w:r>
+        <w:rPr>
+          <w:rFonts w:ascii="Calibri" w:hAnsi="Calibri"/>
+          <w:b/>
+          <w:color w:val="27AE60"/>
+          <w:sz w:val="21"/>
+        </w:rPr>
+        <w:t>📚  De ce avem atât Combiner cât și Reducer în WordCount?</w:t>
+      </w:r>
+    </w:p>
+    <w:p>
+      <w:pPr>
+        <w:shd w:val="clear" w:color="auto" w:fill="EAF7EC"/>
+      </w:pPr>
+      <w:r>
+        <w:rPr>
+          <w:rFonts w:ascii="Calibri" w:hAnsi="Calibri"/>
+          <w:sz w:val="20"/>
+        </w:rPr>
+        <w:t>În codul nostru: job.setCombinerClass(IntSumReducer.class)</w:t>
+      </w:r>
+    </w:p>
+    <w:p>
+      <w:pPr>
+        <w:shd w:val="clear" w:color="auto" w:fill="EAF7EC"/>
+      </w:pPr>
+      <w:r>
+        <w:rPr>
+          <w:rFonts w:ascii="Calibri" w:hAnsi="Calibri"/>
+          <w:sz w:val="20"/>
+        </w:rPr>
+      </w:r>
+    </w:p>
+    <w:p>
+      <w:pPr>
+        <w:shd w:val="clear" w:color="auto" w:fill="EAF7EC"/>
+      </w:pPr>
+      <w:r>
+        <w:rPr>
+          <w:rFonts w:ascii="Calibri" w:hAnsi="Calibri"/>
+          <w:sz w:val="20"/>
+        </w:rPr>
+        <w:t>Combiner-ul este un "mini-Reducer local" care rulează pe fiecare nod înainte de faza Shuffle and Sort. El pre-agregează rezultatele locale pentru a reduce traficul de rețea.</w:t>
+      </w:r>
+    </w:p>
+    <w:p>
+      <w:pPr>
+        <w:shd w:val="clear" w:color="auto" w:fill="EAF7EC"/>
+      </w:pPr>
+      <w:r>
+        <w:rPr>
+          <w:rFonts w:ascii="Calibri" w:hAnsi="Calibri"/>
+          <w:sz w:val="20"/>
+        </w:rPr>
+      </w:r>
+    </w:p>
+    <w:p>
+      <w:pPr>
+        <w:shd w:val="clear" w:color="auto" w:fill="EAF7EC"/>
+      </w:pPr>
+      <w:r>
+        <w:rPr>
+          <w:rFonts w:ascii="Calibri" w:hAnsi="Calibri"/>
+          <w:sz w:val="20"/>
+        </w:rPr>
+        <w:t>Exemplu fără Combiner (ineficient):</w:t>
+      </w:r>
+    </w:p>
+    <w:p>
+      <w:pPr>
+        <w:shd w:val="clear" w:color="auto" w:fill="EAF7EC"/>
+      </w:pPr>
+      <w:r>
+        <w:rPr>
+          <w:rFonts w:ascii="Calibri" w:hAnsi="Calibri"/>
+          <w:sz w:val="20"/>
+        </w:rPr>
+        <w:t xml:space="preserve">  Nod 1: emite (Mochi,1), (Mochi,1), (Mochi,1) → 3 perechi transferate prin rețea</w:t>
+      </w:r>
+    </w:p>
+    <w:p>
+      <w:pPr>
+        <w:shd w:val="clear" w:color="auto" w:fill="EAF7EC"/>
+      </w:pPr>
+      <w:r>
+        <w:rPr>
+          <w:rFonts w:ascii="Calibri" w:hAnsi="Calibri"/>
+          <w:sz w:val="20"/>
+        </w:rPr>
+      </w:r>
+    </w:p>
+    <w:p>
+      <w:pPr>
+        <w:shd w:val="clear" w:color="auto" w:fill="EAF7EC"/>
+      </w:pPr>
+      <w:r>
+        <w:rPr>
+          <w:rFonts w:ascii="Calibri" w:hAnsi="Calibri"/>
+          <w:sz w:val="20"/>
+        </w:rPr>
+        <w:t>Exemplu cu Combiner (eficient):</w:t>
+      </w:r>
+    </w:p>
+    <w:p>
+      <w:pPr>
+        <w:shd w:val="clear" w:color="auto" w:fill="EAF7EC"/>
+      </w:pPr>
+      <w:r>
+        <w:rPr>
+          <w:rFonts w:ascii="Calibri" w:hAnsi="Calibri"/>
+          <w:sz w:val="20"/>
+        </w:rPr>
+        <w:t xml:space="preserve">  Nod 1: Combiner agregă local → emite (Mochi,3) → 1 pereche transferată prin rețea</w:t>
+      </w:r>
+    </w:p>
+    <w:p>
+      <w:pPr>
+        <w:shd w:val="clear" w:color="auto" w:fill="EAF7EC"/>
+      </w:pPr>
+      <w:r>
+        <w:rPr>
+          <w:rFonts w:ascii="Calibri" w:hAnsi="Calibri"/>
+          <w:sz w:val="20"/>
+        </w:rPr>
+      </w:r>
+    </w:p>
+    <w:p>
+      <w:pPr>
+        <w:shd w:val="clear" w:color="auto" w:fill="EAF7EC"/>
+      </w:pPr>
+      <w:r>
+        <w:rPr>
+          <w:rFonts w:ascii="Calibri" w:hAnsi="Calibri"/>
+          <w:sz w:val="20"/>
+        </w:rPr>
+        <w:t>Concluzie: Combiner-ul nu schimbă rezultatul final, dar reduce semnificativ volumul de date transferate între noduri, îmbunătățind performanța.</w:t>
+      </w:r>
+    </w:p>
+    <w:p/>
+    <w:p>
+      <w:r>
+        <w:rPr>
+          <w:rFonts w:ascii="Calibri" w:hAnsi="Calibri"/>
+          <w:sz w:val="21"/>
+        </w:rPr>
+        <w:t>Clasa IntSumReducer este folosită atât ca Combiner cât și ca Reducer deoarece funcția de sumare este comutativă și asociativă – adică ordinea și gruparea operanzilor nu afectează rezultatul: (1+1)+1 = 1+(1+1) = 3. Nu toate operațiile MapReduce permit această optimizare (ex. calculul mediei aritmetice NU poate fi folosit ca Combiner direct).</w:t>
+      </w:r>
+    </w:p>
+    <w:p>
+      <w:pPr>
+        <w:pStyle w:val="Heading2"/>
+      </w:pPr>
+      <w:r>
+        <w:rPr>
+          <w:rFonts w:ascii="Calibri" w:hAnsi="Calibri"/>
+          <w:color w:val="1A73E8"/>
+        </w:rPr>
+        <w:t>13.5 HashPartitioner și Fișierele part-r-*</w:t>
+      </w:r>
+    </w:p>
+    <w:p>
+      <w:pPr>
+        <w:shd w:val="clear" w:color="auto" w:fill="EAF7EC"/>
+      </w:pPr>
+      <w:r>
+        <w:rPr>
+          <w:rFonts w:ascii="Calibri" w:hAnsi="Calibri"/>
+          <w:b/>
+          <w:color w:val="27AE60"/>
+          <w:sz w:val="21"/>
+        </w:rPr>
+        <w:t>📚  De ce avem mai multe fișiere part-r-* în loc de unul singur?</w:t>
+      </w:r>
+    </w:p>
+    <w:p>
+      <w:pPr>
+        <w:shd w:val="clear" w:color="auto" w:fill="EAF7EC"/>
+      </w:pPr>
+      <w:r>
+        <w:rPr>
+          <w:rFonts w:ascii="Calibri" w:hAnsi="Calibri"/>
+          <w:sz w:val="20"/>
+        </w:rPr>
+        <w:t>MapReduce distribuie cheile între Reducer-i prin funcția HashPartitioner:</w:t>
+      </w:r>
+    </w:p>
+    <w:p>
+      <w:pPr>
+        <w:shd w:val="clear" w:color="auto" w:fill="EAF7EC"/>
+      </w:pPr>
+      <w:r>
+        <w:rPr>
+          <w:rFonts w:ascii="Calibri" w:hAnsi="Calibri"/>
+          <w:sz w:val="20"/>
+        </w:rPr>
+        <w:t xml:space="preserve">   partitie = hash(cheie) % numar_reduceri</w:t>
+      </w:r>
+    </w:p>
+    <w:p>
+      <w:pPr>
+        <w:shd w:val="clear" w:color="auto" w:fill="EAF7EC"/>
+      </w:pPr>
+      <w:r>
+        <w:rPr>
+          <w:rFonts w:ascii="Calibri" w:hAnsi="Calibri"/>
+          <w:sz w:val="20"/>
+        </w:rPr>
+      </w:r>
+    </w:p>
+    <w:p>
+      <w:pPr>
+        <w:shd w:val="clear" w:color="auto" w:fill="EAF7EC"/>
+      </w:pPr>
+      <w:r>
+        <w:rPr>
+          <w:rFonts w:ascii="Calibri" w:hAnsi="Calibri"/>
+          <w:sz w:val="20"/>
+        </w:rPr>
+        <w:t>Astfel, fiecare Reducer primește un subset de chei și scrie rezultatele sale într-un fișier separat (part-r-00000, part-r-00001, etc.).</w:t>
+      </w:r>
+    </w:p>
+    <w:p>
+      <w:pPr>
+        <w:shd w:val="clear" w:color="auto" w:fill="EAF7EC"/>
+      </w:pPr>
+      <w:r>
+        <w:rPr>
+          <w:rFonts w:ascii="Calibri" w:hAnsi="Calibri"/>
+          <w:sz w:val="20"/>
+        </w:rPr>
+      </w:r>
+    </w:p>
+    <w:p>
+      <w:pPr>
+        <w:shd w:val="clear" w:color="auto" w:fill="EAF7EC"/>
+      </w:pPr>
+      <w:r>
+        <w:rPr>
+          <w:rFonts w:ascii="Calibri" w:hAnsi="Calibri"/>
+          <w:sz w:val="20"/>
+        </w:rPr>
+        <w:t>Avantaj: paralelism maxim în faza Reduce – N Reducer-i scriu simultan N fișiere.</w:t>
+      </w:r>
+    </w:p>
+    <w:p>
+      <w:pPr>
+        <w:shd w:val="clear" w:color="auto" w:fill="EAF7EC"/>
+      </w:pPr>
+      <w:r>
+        <w:rPr>
+          <w:rFonts w:ascii="Calibri" w:hAnsi="Calibri"/>
+          <w:sz w:val="20"/>
+        </w:rPr>
+        <w:t>Dezavantaj aparent: rezultatele sunt fragmentate în mai multe fișiere.</w:t>
+      </w:r>
+    </w:p>
+    <w:p>
+      <w:pPr>
+        <w:shd w:val="clear" w:color="auto" w:fill="EAF7EC"/>
+      </w:pPr>
+      <w:r>
+        <w:rPr>
+          <w:rFonts w:ascii="Calibri" w:hAnsi="Calibri"/>
+          <w:sz w:val="20"/>
+        </w:rPr>
+      </w:r>
+    </w:p>
+    <w:p>
+      <w:pPr>
+        <w:shd w:val="clear" w:color="auto" w:fill="EAF7EC"/>
+      </w:pPr>
+      <w:r>
+        <w:rPr>
+          <w:rFonts w:ascii="Calibri" w:hAnsi="Calibri"/>
+          <w:sz w:val="20"/>
+        </w:rPr>
+        <w:t>Soluție: concatenăm fișierele cu gsutil cat sau configurăm job.setNumReduceTasks(1).</w:t>
+      </w:r>
+    </w:p>
+    <w:p>
+      <w:pPr>
+        <w:shd w:val="clear" w:color="auto" w:fill="EAF7EC"/>
+      </w:pPr>
+      <w:r>
+        <w:rPr>
+          <w:rFonts w:ascii="Calibri" w:hAnsi="Calibri"/>
+          <w:sz w:val="20"/>
+        </w:rPr>
+      </w:r>
+    </w:p>
+    <w:p>
+      <w:pPr>
+        <w:shd w:val="clear" w:color="auto" w:fill="EAF7EC"/>
+      </w:pPr>
+      <w:r>
+        <w:rPr>
+          <w:rFonts w:ascii="Calibri" w:hAnsi="Calibri"/>
+          <w:sz w:val="20"/>
+        </w:rPr>
+        <w:t>Observație din laborator: cu 3 noduri × 2 vCPU → 11 Reducer-i → 12 fișiere part-r-*,</w:t>
+      </w:r>
+    </w:p>
+    <w:p>
+      <w:pPr>
+        <w:shd w:val="clear" w:color="auto" w:fill="EAF7EC"/>
+      </w:pPr>
+      <w:r>
+        <w:rPr>
+          <w:rFonts w:ascii="Calibri" w:hAnsi="Calibri"/>
+          <w:sz w:val="20"/>
+        </w:rPr>
+        <w:t>dar pentru pisici.txt cu doar ~10 cuvinte unice, 8 fișiere vor fi GOALE (Reducer-ii</w:t>
+      </w:r>
+    </w:p>
+    <w:p>
+      <w:pPr>
+        <w:shd w:val="clear" w:color="auto" w:fill="EAF7EC"/>
+      </w:pPr>
+      <w:r>
+        <w:rPr>
+          <w:rFonts w:ascii="Calibri" w:hAnsi="Calibri"/>
+          <w:sz w:val="20"/>
+        </w:rPr>
+        <w:t>respectivi nu au primit nicio cheie distribuită lor de HashPartitioner).</w:t>
+      </w:r>
+    </w:p>
+    <w:p/>
+    <w:p>
+      <w:pPr>
+        <w:pStyle w:val="Heading2"/>
+      </w:pPr>
+      <w:r>
+        <w:rPr>
+          <w:rFonts w:ascii="Calibri" w:hAnsi="Calibri"/>
+          <w:color w:val="1A73E8"/>
+        </w:rPr>
+        <w:t>13.6 HDFS vs Google Cloud Storage (GCS)</w:t>
+      </w:r>
+    </w:p>
+    <w:p>
+      <w:r>
+        <w:rPr>
+          <w:rFonts w:ascii="Calibri" w:hAnsi="Calibri"/>
+          <w:sz w:val="21"/>
+        </w:rPr>
+        <w:t>Comparație între sistemul de fișiere local Hadoop și stocare cloud:</w:t>
+      </w:r>
+    </w:p>
+    <w:tbl>
+      <w:tblPr>
+        <w:tblStyle w:val="TableGrid"/>
+        <w:tblW w:type="auto" w:w="0"/>
+        <w:tblLook w:firstColumn="1" w:firstRow="1" w:lastColumn="0" w:lastRow="0" w:noHBand="0" w:noVBand="1" w:val="04A0"/>
+      </w:tblPr>
+      <w:tblGrid>
+        <w:gridCol w:w="2880"/>
+        <w:gridCol w:w="2880"/>
+        <w:gridCol w:w="2880"/>
+      </w:tblGrid>
+      <w:tr>
+        <w:tc>
+          <w:tcPr>
+            <w:tcW w:type="dxa" w:w="2880"/>
+          </w:tcPr>
+          <w:p>
+            <w:r>
+              <w:rPr>
+                <w:rFonts w:ascii="Calibri" w:hAnsi="Calibri"/>
+                <w:b/>
+                <w:sz w:val="20"/>
+              </w:rPr>
+              <w:t>Aspect</w:t>
+            </w:r>
+          </w:p>
+        </w:tc>
+        <w:tc>
+          <w:tcPr>
+            <w:tcW w:type="dxa" w:w="2880"/>
+          </w:tcPr>
+          <w:p>
+            <w:r>
+              <w:rPr>
+                <w:rFonts w:ascii="Calibri" w:hAnsi="Calibri"/>
+                <w:b/>
+                <w:sz w:val="20"/>
+              </w:rPr>
+              <w:t>HDFS</w:t>
+            </w:r>
+          </w:p>
+        </w:tc>
+        <w:tc>
+          <w:tcPr>
+            <w:tcW w:type="dxa" w:w="2880"/>
+          </w:tcPr>
+          <w:p>
+            <w:r>
+              <w:rPr>
+                <w:rFonts w:ascii="Calibri" w:hAnsi="Calibri"/>
+                <w:b/>
+                <w:sz w:val="20"/>
+              </w:rPr>
+              <w:t>GCS (cu Dataproc)</w:t>
+            </w:r>
+          </w:p>
+        </w:tc>
+      </w:tr>
+      <w:tr>
+        <w:tc>
+          <w:tcPr>
+            <w:tcW w:type="dxa" w:w="2880"/>
+          </w:tcPr>
+          <w:p>
+            <w:r>
+              <w:rPr>
+                <w:rFonts w:ascii="Calibri" w:hAnsi="Calibri"/>
+                <w:sz w:val="19"/>
+              </w:rPr>
+              <w:t>Stocare date</w:t>
+            </w:r>
+          </w:p>
+        </w:tc>
+        <w:tc>
+          <w:tcPr>
+            <w:tcW w:type="dxa" w:w="2880"/>
+          </w:tcPr>
+          <w:p>
+            <w:r>
+              <w:rPr>
+                <w:rFonts w:ascii="Calibri" w:hAnsi="Calibri"/>
+                <w:sz w:val="19"/>
+              </w:rPr>
+              <w:t>Pe discurile nodurilor din cluster</w:t>
+            </w:r>
+          </w:p>
+        </w:tc>
+        <w:tc>
+          <w:tcPr>
+            <w:tcW w:type="dxa" w:w="2880"/>
+          </w:tcPr>
+          <w:p>
+            <w:r>
+              <w:rPr>
+                <w:rFonts w:ascii="Calibri" w:hAnsi="Calibri"/>
+                <w:sz w:val="19"/>
+              </w:rPr>
+              <w:t>Separat de cluster, în cloud</w:t>
+            </w:r>
+          </w:p>
+        </w:tc>
+      </w:tr>
+      <w:tr>
+        <w:tc>
+          <w:tcPr>
+            <w:tcW w:type="dxa" w:w="2880"/>
+          </w:tcPr>
+          <w:p>
+            <w:r>
+              <w:rPr>
+                <w:rFonts w:ascii="Calibri" w:hAnsi="Calibri"/>
+                <w:sz w:val="19"/>
+              </w:rPr>
+              <w:t>Persistență</w:t>
+            </w:r>
+          </w:p>
+        </w:tc>
+        <w:tc>
+          <w:tcPr>
+            <w:tcW w:type="dxa" w:w="2880"/>
+          </w:tcPr>
+          <w:p>
+            <w:r>
+              <w:rPr>
+                <w:rFonts w:ascii="Calibri" w:hAnsi="Calibri"/>
+                <w:sz w:val="19"/>
+              </w:rPr>
+              <w:t>Date pierdute la ștergerea clusterului</w:t>
+            </w:r>
+          </w:p>
+        </w:tc>
+        <w:tc>
+          <w:tcPr>
+            <w:tcW w:type="dxa" w:w="2880"/>
+          </w:tcPr>
+          <w:p>
+            <w:r>
+              <w:rPr>
+                <w:rFonts w:ascii="Calibri" w:hAnsi="Calibri"/>
+                <w:sz w:val="19"/>
+              </w:rPr>
+              <w:t>Date persistă indiferent de cluster</w:t>
+            </w:r>
+          </w:p>
+        </w:tc>
+      </w:tr>
+      <w:tr>
+        <w:tc>
+          <w:tcPr>
+            <w:tcW w:type="dxa" w:w="2880"/>
+          </w:tcPr>
+          <w:p>
+            <w:r>
+              <w:rPr>
+                <w:rFonts w:ascii="Calibri" w:hAnsi="Calibri"/>
+                <w:sz w:val="19"/>
+              </w:rPr>
+              <w:t>Block size</w:t>
+            </w:r>
+          </w:p>
+        </w:tc>
+        <w:tc>
+          <w:tcPr>
+            <w:tcW w:type="dxa" w:w="2880"/>
+          </w:tcPr>
+          <w:p>
+            <w:r>
+              <w:rPr>
+                <w:rFonts w:ascii="Calibri" w:hAnsi="Calibri"/>
+                <w:sz w:val="19"/>
+              </w:rPr>
+              <w:t>128 MB (default) sau 256 MB</w:t>
+            </w:r>
+          </w:p>
+        </w:tc>
+        <w:tc>
+          <w:tcPr>
+            <w:tcW w:type="dxa" w:w="2880"/>
+          </w:tcPr>
+          <w:p>
+            <w:r>
+              <w:rPr>
+                <w:rFonts w:ascii="Calibri" w:hAnsi="Calibri"/>
+                <w:sz w:val="19"/>
+              </w:rPr>
+              <w:t>64–128 MB (configurat de Hadoop)</w:t>
+            </w:r>
+          </w:p>
+        </w:tc>
+      </w:tr>
+      <w:tr>
+        <w:tc>
+          <w:tcPr>
+            <w:tcW w:type="dxa" w:w="2880"/>
+          </w:tcPr>
+          <w:p>
+            <w:r>
+              <w:rPr>
+                <w:rFonts w:ascii="Calibri" w:hAnsi="Calibri"/>
+                <w:sz w:val="19"/>
+              </w:rPr>
+              <w:t>Replicare</w:t>
+            </w:r>
+          </w:p>
+        </w:tc>
+        <w:tc>
+          <w:tcPr>
+            <w:tcW w:type="dxa" w:w="2880"/>
+          </w:tcPr>
+          <w:p>
+            <w:r>
+              <w:rPr>
+                <w:rFonts w:ascii="Calibri" w:hAnsi="Calibri"/>
+                <w:sz w:val="19"/>
+              </w:rPr>
+              <w:t>3 replici (default)</w:t>
+            </w:r>
+          </w:p>
+        </w:tc>
+        <w:tc>
+          <w:tcPr>
+            <w:tcW w:type="dxa" w:w="2880"/>
+          </w:tcPr>
+          <w:p>
+            <w:r>
+              <w:rPr>
+                <w:rFonts w:ascii="Calibri" w:hAnsi="Calibri"/>
+                <w:sz w:val="19"/>
+              </w:rPr>
+              <w:t>Gestionată intern de Google</w:t>
+            </w:r>
+          </w:p>
+        </w:tc>
+      </w:tr>
+      <w:tr>
+        <w:tc>
+          <w:tcPr>
+            <w:tcW w:type="dxa" w:w="2880"/>
+          </w:tcPr>
+          <w:p>
+            <w:r>
+              <w:rPr>
+                <w:rFonts w:ascii="Calibri" w:hAnsi="Calibri"/>
+                <w:sz w:val="19"/>
+              </w:rPr>
+              <w:t>Cost</w:t>
+            </w:r>
+          </w:p>
+        </w:tc>
+        <w:tc>
+          <w:tcPr>
+            <w:tcW w:type="dxa" w:w="2880"/>
+          </w:tcPr>
+          <w:p>
+            <w:r>
+              <w:rPr>
+                <w:rFonts w:ascii="Calibri" w:hAnsi="Calibri"/>
+                <w:sz w:val="19"/>
+              </w:rPr>
+              <w:t>Clusterul trebuie să ruleze permanent</w:t>
+            </w:r>
+          </w:p>
+        </w:tc>
+        <w:tc>
+          <w:tcPr>
+            <w:tcW w:type="dxa" w:w="2880"/>
+          </w:tcPr>
+          <w:p>
+            <w:r>
+              <w:rPr>
+                <w:rFonts w:ascii="Calibri" w:hAnsi="Calibri"/>
+                <w:sz w:val="19"/>
+              </w:rPr>
+              <w:t>Plătești doar stocarea (ieftin)</w:t>
+            </w:r>
+          </w:p>
+        </w:tc>
+      </w:tr>
+      <w:tr>
+        <w:tc>
+          <w:tcPr>
+            <w:tcW w:type="dxa" w:w="2880"/>
+          </w:tcPr>
+          <w:p>
+            <w:r>
+              <w:rPr>
+                <w:rFonts w:ascii="Calibri" w:hAnsi="Calibri"/>
+                <w:sz w:val="19"/>
+              </w:rPr>
+              <w:t>Scalabilitate</w:t>
+            </w:r>
+          </w:p>
+        </w:tc>
+        <w:tc>
+          <w:tcPr>
+            <w:tcW w:type="dxa" w:w="2880"/>
+          </w:tcPr>
+          <w:p>
+            <w:r>
+              <w:rPr>
+                <w:rFonts w:ascii="Calibri" w:hAnsi="Calibri"/>
+                <w:sz w:val="19"/>
+              </w:rPr>
+              <w:t>Limitată de capacitatea nodurilor</w:t>
+            </w:r>
+          </w:p>
+        </w:tc>
+        <w:tc>
+          <w:tcPr>
+            <w:tcW w:type="dxa" w:w="2880"/>
+          </w:tcPr>
+          <w:p>
+            <w:r>
+              <w:rPr>
+                <w:rFonts w:ascii="Calibri" w:hAnsi="Calibri"/>
+                <w:sz w:val="19"/>
+              </w:rPr>
+              <w:t>Practic nelimitată</w:t>
+            </w:r>
+          </w:p>
+        </w:tc>
+      </w:tr>
+    </w:tbl>
+    <w:p/>
+    <w:p>
+      <w:pPr>
+        <w:pStyle w:val="Heading2"/>
+      </w:pPr>
+      <w:r>
+        <w:rPr>
+          <w:rFonts w:ascii="Calibri" w:hAnsi="Calibri"/>
+          <w:color w:val="1A73E8"/>
+        </w:rPr>
+        <w:t>13.7 Sinteză: Ce Am Învățat din Acest Laborator?</w:t>
+      </w:r>
+    </w:p>
+    <w:p>
+      <w:r>
+        <w:rPr>
+          <w:rFonts w:ascii="Calibri" w:hAnsi="Calibri"/>
+          <w:sz w:val="21"/>
+        </w:rPr>
+        <w:t>Prin parcurgerea acestui laborator am înțeles că Apache Hadoop nu este doar un program, ci un întreg ecosistem de procesare distribuită. Elementele cheie sunt:</w:t>
+      </w:r>
+    </w:p>
+    <w:p>
+      <w:pPr>
+        <w:pStyle w:val="ListBullet"/>
+      </w:pPr>
+      <w:r>
+        <w:rPr>
+          <w:rFonts w:ascii="Calibri" w:hAnsi="Calibri"/>
+          <w:sz w:val="21"/>
+        </w:rPr>
+        <w:t>Hadoop = HDFS (stocare distribuită) + MapReduce (procesare paralelă) + YARN (management resurse).</w:t>
+      </w:r>
+    </w:p>
+    <w:p>
+      <w:pPr>
+        <w:pStyle w:val="ListBullet"/>
+      </w:pPr>
+      <w:r>
+        <w:rPr>
+          <w:rFonts w:ascii="Calibri" w:hAnsi="Calibri"/>
+          <w:sz w:val="21"/>
+        </w:rPr>
+        <w:t>MapReduce urmează un flux clar: Input Split → Map → Shuffle &amp; Sort → Reduce → Output.</w:t>
+      </w:r>
+    </w:p>
+    <w:p>
+      <w:pPr>
+        <w:pStyle w:val="ListBullet"/>
+      </w:pPr>
+      <w:r>
+        <w:rPr>
+          <w:rFonts w:ascii="Calibri" w:hAnsi="Calibri"/>
+          <w:sz w:val="21"/>
+        </w:rPr>
+        <w:t>Combiner-ul este o optimizare crucială care reduce traficul de rețea prin pre-agregare locală.</w:t>
+      </w:r>
+    </w:p>
+    <w:p>
+      <w:pPr>
+        <w:pStyle w:val="ListBullet"/>
+      </w:pPr>
+      <w:r>
+        <w:rPr>
+          <w:rFonts w:ascii="Calibri" w:hAnsi="Calibri"/>
+          <w:sz w:val="21"/>
+        </w:rPr>
+        <w:t>HashPartitioner distribuie cheile uniform între Reducer-i; un număr mare de Reducer-i înseamnă mai multe fișiere part-r-*, unele potențial goale.</w:t>
+      </w:r>
+    </w:p>
+    <w:p>
+      <w:pPr>
+        <w:pStyle w:val="ListBullet"/>
+      </w:pPr>
+      <w:r>
+        <w:rPr>
+          <w:rFonts w:ascii="Calibri" w:hAnsi="Calibri"/>
+          <w:sz w:val="21"/>
+        </w:rPr>
+        <w:t>Google Cloud Dataproc simplifică radical administrarea clusterelor Hadoop: creare în ~90 secunde, integrare nativă cu GCS, scalabilitate la cerere și plată per utilizare.</w:t>
+      </w:r>
+    </w:p>
+    <w:p>
+      <w:pPr>
+        <w:pStyle w:val="ListBullet"/>
+      </w:pPr>
+      <w:r>
+        <w:rPr>
+          <w:rFonts w:ascii="Calibri" w:hAnsi="Calibri"/>
+          <w:sz w:val="21"/>
+        </w:rPr>
+        <w:t>Cel mai important aspect practic: datele de intrare și ieșire sunt stocate în GCS (nu în HDFS), deci persistă și după ștergerea clusterului – model economic recomandat în cloud.</w:t>
+      </w:r>
+    </w:p>
+    <w:p>
+      <w:r>
+        <w:rPr>
+          <w:rFonts w:ascii="Calibri" w:hAnsi="Calibri"/>
+          <w:color w:val="2C3E50"/>
+          <w:sz w:val="21"/>
+        </w:rPr>
+        <w:t>Varianta personalizată cu pisici.txt demonstrează că aceleași concepte se aplică indiferent de domeniu: același cod Java WordCount.java, același cluster Dataproc, aceleași comenzi gsutil – doar datele de intrare sunt diferite. Aceasta este esența Big Data processing: algoritmi generici aplicați pe date specifice problemei tale.</w:t>
       </w:r>
     </w:p>
     <w:sectPr>

</xml_diff>